<commit_message>
precios: sube suéter UVEG por escalón de costo (355 / 365 / 375)
Costo Martell 19-oct: T16 174, T34-38 184, T40-42 197; la venta estaba
plana en 345-355. Nuevo: 14,16 → 355; 32-38 → 365; 40,42 → 375.
Actualiza productos.db, reglas, guías, generadores y tarifarios.

Co-Authored-By: Claude Opus 5.5 <noreply@anthropic.com>
Claude-Session: https://claude.ai/code/session_013TAdPYCzYnnxbKNVjFhHCP
</commit_message>
<xml_diff>
--- a/Gestor_de_Inventarios/tarifarios/Tarifario_Completo_2026.docx
+++ b/Gestor_de_Inventarios/tarifarios/Tarifario_Completo_2026.docx
@@ -3777,7 +3777,7 @@
                       <w:color w:val="1E3A6E"/>
                       <w:sz w:val="18"/>
                     </w:rPr>
-                    <w:t>14, 16, 32–42</w:t>
+                    <w:t>14, 16</w:t>
                   </w:r>
                 </w:p>
               </w:tc>
@@ -3804,6 +3804,166 @@
                       <w:sz w:val="18"/>
                     </w:rPr>
                     <w:t>$355</w:t>
+                  </w:r>
+                </w:p>
+              </w:tc>
+            </w:tr>
+            <w:tr>
+              <w:tc>
+                <w:tcPr>
+                  <w:tcW w:type="dxa" w:w="1707"/>
+                  <w:shd w:val="clear" w:color="auto" w:fill="FDF0F0"/>
+                  <w:tcMar>
+                    <w:top w:w="48" w:type="dxa"/>
+                    <w:bottom w:w="48" w:type="dxa"/>
+                    <w:left w:w="100" w:type="dxa"/>
+                    <w:right w:w="100" w:type="dxa"/>
+                  </w:tcMar>
+                </w:tcPr>
+                <w:p>
+                  <w:pPr>
+                    <w:spacing w:before="0" w:after="0"/>
+                    <w:jc w:val="left"/>
+                  </w:pPr>
+                  <w:r>
+                    <w:rPr>
+                      <w:b w:val="0"/>
+                      <w:color w:val="1A1A2E"/>
+                      <w:sz w:val="18"/>
+                    </w:rPr>
+                    <w:t>UVEG</w:t>
+                  </w:r>
+                </w:p>
+              </w:tc>
+              <w:tc>
+                <w:tcPr>
+                  <w:tcW w:type="dxa" w:w="1707"/>
+                  <w:shd w:val="clear" w:color="auto" w:fill="FDF0F0"/>
+                  <w:tcMar>
+                    <w:top w:w="48" w:type="dxa"/>
+                    <w:bottom w:w="48" w:type="dxa"/>
+                    <w:left w:w="100" w:type="dxa"/>
+                    <w:right w:w="100" w:type="dxa"/>
+                  </w:tcMar>
+                </w:tcPr>
+                <w:p>
+                  <w:pPr>
+                    <w:spacing w:before="0" w:after="0"/>
+                    <w:jc w:val="right"/>
+                  </w:pPr>
+                  <w:r>
+                    <w:rPr>
+                      <w:b/>
+                      <w:color w:val="1E3A6E"/>
+                      <w:sz w:val="18"/>
+                    </w:rPr>
+                    <w:t>32–38</w:t>
+                  </w:r>
+                </w:p>
+              </w:tc>
+              <w:tc>
+                <w:tcPr>
+                  <w:tcW w:type="dxa" w:w="1707"/>
+                  <w:shd w:val="clear" w:color="auto" w:fill="FDF0F0"/>
+                  <w:tcMar>
+                    <w:top w:w="48" w:type="dxa"/>
+                    <w:bottom w:w="48" w:type="dxa"/>
+                    <w:left w:w="100" w:type="dxa"/>
+                    <w:right w:w="100" w:type="dxa"/>
+                  </w:tcMar>
+                </w:tcPr>
+                <w:p>
+                  <w:pPr>
+                    <w:spacing w:before="0" w:after="0"/>
+                    <w:jc w:val="right"/>
+                  </w:pPr>
+                  <w:r>
+                    <w:rPr>
+                      <w:b/>
+                      <w:color w:val="1E3A6E"/>
+                      <w:sz w:val="18"/>
+                    </w:rPr>
+                    <w:t>$365</w:t>
+                  </w:r>
+                </w:p>
+              </w:tc>
+            </w:tr>
+            <w:tr>
+              <w:tc>
+                <w:tcPr>
+                  <w:tcW w:type="dxa" w:w="1707"/>
+                  <w:shd w:val="clear" w:color="auto" w:fill="FFFFFF"/>
+                  <w:tcMar>
+                    <w:top w:w="48" w:type="dxa"/>
+                    <w:bottom w:w="48" w:type="dxa"/>
+                    <w:left w:w="100" w:type="dxa"/>
+                    <w:right w:w="100" w:type="dxa"/>
+                  </w:tcMar>
+                </w:tcPr>
+                <w:p>
+                  <w:pPr>
+                    <w:spacing w:before="0" w:after="0"/>
+                    <w:jc w:val="left"/>
+                  </w:pPr>
+                  <w:r>
+                    <w:rPr>
+                      <w:b w:val="0"/>
+                      <w:color w:val="1A1A2E"/>
+                      <w:sz w:val="18"/>
+                    </w:rPr>
+                    <w:t>UVEG</w:t>
+                  </w:r>
+                </w:p>
+              </w:tc>
+              <w:tc>
+                <w:tcPr>
+                  <w:tcW w:type="dxa" w:w="1707"/>
+                  <w:shd w:val="clear" w:color="auto" w:fill="FFFFFF"/>
+                  <w:tcMar>
+                    <w:top w:w="48" w:type="dxa"/>
+                    <w:bottom w:w="48" w:type="dxa"/>
+                    <w:left w:w="100" w:type="dxa"/>
+                    <w:right w:w="100" w:type="dxa"/>
+                  </w:tcMar>
+                </w:tcPr>
+                <w:p>
+                  <w:pPr>
+                    <w:spacing w:before="0" w:after="0"/>
+                    <w:jc w:val="right"/>
+                  </w:pPr>
+                  <w:r>
+                    <w:rPr>
+                      <w:b/>
+                      <w:color w:val="1E3A6E"/>
+                      <w:sz w:val="18"/>
+                    </w:rPr>
+                    <w:t>40, 42</w:t>
+                  </w:r>
+                </w:p>
+              </w:tc>
+              <w:tc>
+                <w:tcPr>
+                  <w:tcW w:type="dxa" w:w="1707"/>
+                  <w:shd w:val="clear" w:color="auto" w:fill="FFFFFF"/>
+                  <w:tcMar>
+                    <w:top w:w="48" w:type="dxa"/>
+                    <w:bottom w:w="48" w:type="dxa"/>
+                    <w:left w:w="100" w:type="dxa"/>
+                    <w:right w:w="100" w:type="dxa"/>
+                  </w:tcMar>
+                </w:tcPr>
+                <w:p>
+                  <w:pPr>
+                    <w:spacing w:before="0" w:after="0"/>
+                    <w:jc w:val="right"/>
+                  </w:pPr>
+                  <w:r>
+                    <w:rPr>
+                      <w:b/>
+                      <w:color w:val="1E3A6E"/>
+                      <w:sz w:val="18"/>
+                    </w:rPr>
+                    <w:t>$375</w:t>
                   </w:r>
                 </w:p>
               </w:tc>
@@ -4148,7 +4308,7 @@
                       <w:color w:val="1E3A6E"/>
                       <w:sz w:val="18"/>
                     </w:rPr>
-                    <w:t>4, 6, 8</w:t>
+                    <w:t>4, 6, 8, 10</w:t>
                   </w:r>
                 </w:p>
               </w:tc>

</xml_diff>